<commit_message>
Synchronize strengthened PDAC Figure 4 text
</commit_message>
<xml_diff>
--- a/output/doc/RMTGuard_corresponding_author_signoff_packet.docx
+++ b/output/doc/RMTGuard_corresponding_author_signoff_packet.docx
@@ -16,7 +16,7 @@
         <w:jc w:val="center"/>
       </w:pPr>
       <w:r>
-        <w:t>Nature Methods presubmission route control - generated 2026-05-10</w:t>
+        <w:t>Nature Methods presubmission route control - generated 2026-05-11</w:t>
       </w:r>
     </w:p>
     <w:p>
@@ -85,7 +85,7 @@
     </w:p>
     <w:p>
       <w:r>
-        <w:t>**Figure 4 | Bounded PDAC/TME public-data showcase of RMTGuard callability.** Public PDAC/TME scRNA-seq datasets were used as a bounded application to illustrate how RMTGuard reports callable cell-state structure together with pathway and atlas-marker support. Rank-based pathway testing identified 189 Hallmark and 1466 Reactome significant rows, with 215 retained as manuscript-interpretable pathway hits after excluding low-specificity labels. Representative hits include pdac_gse154778 cluster 2: HALLMARK_EPITHELIAL_MESENCHYMAL_TRANSITION (BH-FDR=6.20e-26); pdac_gse263733 cluster 0: REACTOME_CYTOKINE_SIGNALING_IN_IMMUNE_SYSTEM (BH-FDR=1.31e-24); pdac_gse263733 cluster 2: HALLMARK_TNFA_SIGNALING_VIA_NFKB (BH-FDR=2.16e-20); pdac_gse263733 cluster 3: REACTOME_CYTOKINE_SIGNALING_IN_IMMUNE_SYSTEM (BH-FDR=1.15e-19); pdac_gse263733 cluster 2: REACTOME_CYTOKINE_SIGNALING_IN_IMMUNE_SYSTEM (BH-FDR=1.80e-15). Atlas-marker comparison supported 7 cluster/signature rows with at least two overlapping published markers. Representative supported labels include pdac_gse154778 cluster 0: ductal/malignant-context (Peng et al., Cell Research 2019, overlap=7); pdac_gse154778 cluster 1: ductal/malignant-context (Peng et al., Cell Research 2019, overlap=3); pdac_gse154778 cluster 3: myeloid/macrophage (Peng et al., Cell Research 2019, overlap=10); pdac_gse263733 cluster 0: T/NK cell (Oh et al., Nature Communications 2023, overlap=9); pdac_gse263733 cluster 1: ductal/malignant-context (Peng et al., Cell Research 2019, overlap=8); pdac_gse263733 cluster 2: myeloid/macrophage (Peng et al., Cell Research 2019, overlap=10). All PDAC/TME interpretations are public-data, non-clinical, and hypothesis-generating.</w:t>
+        <w:t>**Figure 4 | Bounded public-data PDAC/TME application of RMTGuard.** (A) Evidence board summarizing the claim-bounded PDAC/TME application layers and the corresponding stop rules. (B) Marker-program heatmap for RMTGuard clusters in GSE154778 and GSE263733, highlighting ductal/malignant-context, myeloid, T/NK, B/plasma, CAF/fibroblast, and endothelial marker families. (C) External signature transfer layer; 5 primary signatures matched expected public labels; 4 matched validation RMTGuard cluster signatures; shared families: ductal/malignant-context, immune-myeloid. (D) Rank-based pathway layer; 189 Hallmark and 1466 Reactome pathways pass BH-FDR &lt;=0.05 with positive rank effect. (E) Published atlas-marker overlap layer; 7 cluster-signature rows have &gt;=2 marker overlaps with cited PDAC atlas/reference marker families. (F) Stability boundary layer; GSE154778 RMTGuard ARI=0.619 vs best baseline scanpy_default_like=0.793; GSE263733 RMTGuard ARI=0.704 vs best baseline scanpy_default_like=0.785. Marker evidence: 9802 positive cluster-marker rows at BH-FDR &lt;=0.05; 3 tiny clusters skipped by rule. All analyses use public scRNA-seq datasets and are presented as a hypothesis-generating methods showcase. No panel is used to claim a new PDAC mechanism, a new CAF subtype, clinical validation, prognosis, therapy-response prediction, patient-level utility, spatial validation, or protein validation.</w:t>
       </w:r>
     </w:p>
     <w:p>

</xml_diff>